<commit_message>
fix register form and manage appointments page
</commit_message>
<xml_diff>
--- a/docs/T6/plan_instalacion/Plan_de_Instalacion_HealthConnection.docx
+++ b/docs/T6/plan_instalacion/Plan_de_Instalacion_HealthConnection.docx
@@ -97,21 +97,8 @@
         <w:pStyle w:val="Ttulo1"/>
       </w:pPr>
       <w:r>
-        <w:t xml:space="preserve">2. </w:t>
+        <w:t>2. Estructura del proyecto</w:t>
       </w:r>
-      <w:proofErr w:type="spellStart"/>
-      <w:r>
-        <w:t>Estructura</w:t>
-      </w:r>
-      <w:proofErr w:type="spellEnd"/>
-      <w:r>
-        <w:t xml:space="preserve"> del </w:t>
-      </w:r>
-      <w:proofErr w:type="spellStart"/>
-      <w:r>
-        <w:t>proyecto</w:t>
-      </w:r>
-      <w:proofErr w:type="spellEnd"/>
       <w:r>
         <w:br/>
       </w:r>
@@ -147,44 +134,6 @@
         <w:rPr>
           <w:rFonts w:hint="eastAsia"/>
         </w:rPr>
-        <w:t>│</w:t>
-      </w:r>
-      <w:r>
-        <w:rPr>
-          <w:rFonts w:hint="eastAsia"/>
-        </w:rPr>
-        <w:t xml:space="preserve">   </w:t>
-      </w:r>
-      <w:r>
-        <w:rPr>
-          <w:rFonts w:hint="eastAsia"/>
-        </w:rPr>
-        <w:t>├──</w:t>
-      </w:r>
-      <w:r>
-        <w:rPr>
-          <w:rFonts w:hint="eastAsia"/>
-        </w:rPr>
-        <w:t xml:space="preserve"> Dockerfile      </w:t>
-      </w:r>
-      <w:r>
-        <w:t>#</w:t>
-      </w:r>
-      <w:r>
-        <w:t xml:space="preserve"> </w:t>
-      </w:r>
-      <w:r>
-        <w:rPr>
-          <w:rFonts w:hint="eastAsia"/>
-        </w:rPr>
-        <w:t>Para el frontend (React + Vite)</w:t>
-      </w:r>
-    </w:p>
-    <w:p>
-      <w:r>
-        <w:rPr>
-          <w:rFonts w:hint="eastAsia"/>
-        </w:rPr>
         <w:t>├──</w:t>
       </w:r>
       <w:r>
@@ -201,92 +150,15 @@
       </w:r>
     </w:p>
     <w:p>
-      <w:pPr>
-        <w:rPr>
-          <w:lang w:val="es-CO"/>
-        </w:rPr>
-      </w:pPr>
       <w:r>
         <w:rPr>
           <w:rFonts w:hint="eastAsia"/>
-          <w:lang w:val="es-CO"/>
-        </w:rPr>
-        <w:t>│</w:t>
-      </w:r>
-      <w:r>
-        <w:rPr>
-          <w:rFonts w:hint="eastAsia"/>
-          <w:lang w:val="es-CO"/>
-        </w:rPr>
-        <w:t xml:space="preserve">   </w:t>
-      </w:r>
-      <w:r>
-        <w:rPr>
-          <w:rFonts w:hint="eastAsia"/>
-          <w:lang w:val="es-CO"/>
         </w:rPr>
         <w:t>├──</w:t>
       </w:r>
       <w:r>
         <w:rPr>
           <w:rFonts w:hint="eastAsia"/>
-          <w:lang w:val="es-CO"/>
-        </w:rPr>
-        <w:t xml:space="preserve"> </w:t>
-      </w:r>
-      <w:proofErr w:type="spellStart"/>
-      <w:r>
-        <w:rPr>
-          <w:rFonts w:hint="eastAsia"/>
-          <w:lang w:val="es-CO"/>
-        </w:rPr>
-        <w:t>Dockerfile</w:t>
-      </w:r>
-      <w:proofErr w:type="spellEnd"/>
-      <w:r>
-        <w:rPr>
-          <w:rFonts w:hint="eastAsia"/>
-          <w:lang w:val="es-CO"/>
-        </w:rPr>
-        <w:t xml:space="preserve">     </w:t>
-      </w:r>
-      <w:r>
-        <w:rPr>
-          <w:lang w:val="es-CO"/>
-        </w:rPr>
-        <w:t xml:space="preserve"> #</w:t>
-      </w:r>
-      <w:r>
-        <w:rPr>
-          <w:lang w:val="es-CO"/>
-        </w:rPr>
-        <w:t xml:space="preserve"> </w:t>
-      </w:r>
-      <w:r>
-        <w:rPr>
-          <w:rFonts w:hint="eastAsia"/>
-          <w:lang w:val="es-CO"/>
-        </w:rPr>
-        <w:t>Para el backend (Node.js + Express)</w:t>
-      </w:r>
-    </w:p>
-    <w:p>
-      <w:pPr>
-        <w:rPr>
-          <w:lang w:val="es-CO"/>
-        </w:rPr>
-      </w:pPr>
-      <w:r>
-        <w:rPr>
-          <w:rFonts w:hint="eastAsia"/>
-          <w:lang w:val="es-CO"/>
-        </w:rPr>
-        <w:t>├──</w:t>
-      </w:r>
-      <w:r>
-        <w:rPr>
-          <w:rFonts w:hint="eastAsia"/>
-          <w:lang w:val="es-CO"/>
         </w:rPr>
         <w:t xml:space="preserve"> docker-compose.yml</w:t>
       </w:r>
@@ -298,10 +170,13 @@
         </w:rPr>
       </w:pPr>
       <w:r>
+        <w:t xml:space="preserve"> </w:t>
+      </w:r>
+      <w:r>
         <w:rPr>
           <w:lang w:val="es-CO"/>
         </w:rPr>
-        <w:t xml:space="preserve"> |</w:t>
+        <w:t>|</w:t>
       </w:r>
       <w:r>
         <w:rPr>
@@ -314,16 +189,8 @@
         <w:rPr>
           <w:lang w:val="es-CO"/>
         </w:rPr>
-        <w:t xml:space="preserve">. </w:t>
+        <w:t>. env  #</w:t>
       </w:r>
-      <w:proofErr w:type="gramStart"/>
-      <w:r>
-        <w:rPr>
-          <w:lang w:val="es-CO"/>
-        </w:rPr>
-        <w:t>env  #</w:t>
-      </w:r>
-      <w:proofErr w:type="gramEnd"/>
       <w:r>
         <w:rPr>
           <w:lang w:val="es-CO"/>
@@ -385,9 +252,6 @@
       </w:r>
       <w:r>
         <w:br/>
-      </w:r>
-      <w:r>
-        <w:lastRenderedPageBreak/>
         <w:t>DB_NAME=healthconnection</w:t>
       </w:r>
       <w:r>
@@ -404,6 +268,9 @@
       </w:r>
       <w:r>
         <w:br/>
+      </w:r>
+      <w:r>
+        <w:lastRenderedPageBreak/>
         <w:t>JWT_RECOVERY_PASS_SECRET=lavidaesasiyyoquieroasi</w:t>
       </w:r>
       <w:r>
@@ -496,13 +363,8 @@
       </w:r>
       <w:r>
         <w:br/>
-        <w:t>cd</w:t>
+        <w:t>cd ..</w:t>
       </w:r>
-      <w:proofErr w:type="gramStart"/>
-      <w:r>
-        <w:t xml:space="preserve"> ..</w:t>
-      </w:r>
-      <w:proofErr w:type="gramEnd"/>
     </w:p>
     <w:p>
       <w:pPr>
@@ -638,7 +500,6 @@
         <w:rPr>
           <w:lang w:val="es-CO"/>
         </w:rPr>
-        <w:lastRenderedPageBreak/>
         <w:t>5.2. Base de datos PostgreSQL</w:t>
       </w:r>
     </w:p>
@@ -660,6 +521,12 @@
           <w:lang w:val="es-CO"/>
         </w:rPr>
         <w:br/>
+      </w:r>
+      <w:r>
+        <w:rPr>
+          <w:lang w:val="es-CO"/>
+        </w:rPr>
+        <w:lastRenderedPageBreak/>
         <w:t>2. Railway te dará un DATABASE_URL.</w:t>
       </w:r>
       <w:r>
@@ -824,6 +691,748 @@
         </w:rPr>
         <w:br/>
       </w:r>
+    </w:p>
+    <w:p>
+      <w:pPr>
+        <w:rPr>
+          <w:lang w:val="es-CO"/>
+        </w:rPr>
+      </w:pPr>
+      <w:r>
+        <w:rPr>
+          <w:lang w:val="es-CO"/>
+        </w:rPr>
+        <w:br w:type="page"/>
+      </w:r>
+    </w:p>
+    <w:p>
+      <w:pPr>
+        <w:pStyle w:val="Ttulo1"/>
+        <w:rPr>
+          <w:lang w:val="es-CO"/>
+        </w:rPr>
+      </w:pPr>
+      <w:r>
+        <w:rPr>
+          <w:lang w:val="es-CO"/>
+        </w:rPr>
+        <w:lastRenderedPageBreak/>
+        <w:t>Cronograma de Instalación y Despliegue — HealthConnection</w:t>
+      </w:r>
+    </w:p>
+    <w:tbl>
+      <w:tblPr>
+        <w:tblStyle w:val="Tablaconcuadrcula"/>
+        <w:tblW w:w="0" w:type="auto"/>
+        <w:tblLook w:val="04A0" w:firstRow="1" w:lastRow="0" w:firstColumn="1" w:lastColumn="0" w:noHBand="0" w:noVBand="1"/>
+      </w:tblPr>
+      <w:tblGrid>
+        <w:gridCol w:w="1728"/>
+        <w:gridCol w:w="1728"/>
+        <w:gridCol w:w="1728"/>
+        <w:gridCol w:w="1728"/>
+        <w:gridCol w:w="1923"/>
+      </w:tblGrid>
+      <w:tr>
+        <w:tc>
+          <w:tcPr>
+            <w:tcW w:w="1728" w:type="dxa"/>
+          </w:tcPr>
+          <w:p>
+            <w:r>
+              <w:t>N°</w:t>
+            </w:r>
+          </w:p>
+        </w:tc>
+        <w:tc>
+          <w:tcPr>
+            <w:tcW w:w="1728" w:type="dxa"/>
+          </w:tcPr>
+          <w:p>
+            <w:r>
+              <w:t>Tarea</w:t>
+            </w:r>
+          </w:p>
+        </w:tc>
+        <w:tc>
+          <w:tcPr>
+            <w:tcW w:w="1728" w:type="dxa"/>
+          </w:tcPr>
+          <w:p>
+            <w:r>
+              <w:t>Responsable</w:t>
+            </w:r>
+          </w:p>
+        </w:tc>
+        <w:tc>
+          <w:tcPr>
+            <w:tcW w:w="1728" w:type="dxa"/>
+          </w:tcPr>
+          <w:p>
+            <w:r>
+              <w:t>Duración estimada</w:t>
+            </w:r>
+          </w:p>
+        </w:tc>
+        <w:tc>
+          <w:tcPr>
+            <w:tcW w:w="1728" w:type="dxa"/>
+          </w:tcPr>
+          <w:p>
+            <w:r>
+              <w:t>Descripción</w:t>
+            </w:r>
+          </w:p>
+        </w:tc>
+      </w:tr>
+      <w:tr>
+        <w:tc>
+          <w:tcPr>
+            <w:tcW w:w="1728" w:type="dxa"/>
+          </w:tcPr>
+          <w:p>
+            <w:r>
+              <w:t>1</w:t>
+            </w:r>
+          </w:p>
+        </w:tc>
+        <w:tc>
+          <w:tcPr>
+            <w:tcW w:w="1728" w:type="dxa"/>
+          </w:tcPr>
+          <w:p>
+            <w:r>
+              <w:t>Clonación del repositorio</w:t>
+            </w:r>
+          </w:p>
+        </w:tc>
+        <w:tc>
+          <w:tcPr>
+            <w:tcW w:w="1728" w:type="dxa"/>
+          </w:tcPr>
+          <w:p>
+            <w:r>
+              <w:t>DevOps / Backend Dev</w:t>
+            </w:r>
+          </w:p>
+        </w:tc>
+        <w:tc>
+          <w:tcPr>
+            <w:tcW w:w="1728" w:type="dxa"/>
+          </w:tcPr>
+          <w:p>
+            <w:r>
+              <w:t>30 min</w:t>
+            </w:r>
+          </w:p>
+        </w:tc>
+        <w:tc>
+          <w:tcPr>
+            <w:tcW w:w="1728" w:type="dxa"/>
+          </w:tcPr>
+          <w:p>
+            <w:pPr>
+              <w:rPr>
+                <w:lang w:val="es-CO"/>
+              </w:rPr>
+            </w:pPr>
+            <w:r>
+              <w:rPr>
+                <w:lang w:val="es-CO"/>
+              </w:rPr>
+              <w:t>Clonar el repositorio de GitHub y validar acceso.</w:t>
+            </w:r>
+          </w:p>
+        </w:tc>
+      </w:tr>
+      <w:tr>
+        <w:tc>
+          <w:tcPr>
+            <w:tcW w:w="1728" w:type="dxa"/>
+          </w:tcPr>
+          <w:p>
+            <w:r>
+              <w:t>2</w:t>
+            </w:r>
+          </w:p>
+        </w:tc>
+        <w:tc>
+          <w:tcPr>
+            <w:tcW w:w="1728" w:type="dxa"/>
+          </w:tcPr>
+          <w:p>
+            <w:r>
+              <w:t>Instalación de dependencias</w:t>
+            </w:r>
+          </w:p>
+        </w:tc>
+        <w:tc>
+          <w:tcPr>
+            <w:tcW w:w="1728" w:type="dxa"/>
+          </w:tcPr>
+          <w:p>
+            <w:r>
+              <w:t>Backend Dev / Frontend Dev</w:t>
+            </w:r>
+          </w:p>
+        </w:tc>
+        <w:tc>
+          <w:tcPr>
+            <w:tcW w:w="1728" w:type="dxa"/>
+          </w:tcPr>
+          <w:p>
+            <w:r>
+              <w:t>1 h</w:t>
+            </w:r>
+          </w:p>
+        </w:tc>
+        <w:tc>
+          <w:tcPr>
+            <w:tcW w:w="1728" w:type="dxa"/>
+          </w:tcPr>
+          <w:p>
+            <w:pPr>
+              <w:rPr>
+                <w:lang w:val="es-CO"/>
+              </w:rPr>
+            </w:pPr>
+            <w:r>
+              <w:rPr>
+                <w:lang w:val="es-CO"/>
+              </w:rPr>
+              <w:t>Ejecutar `npm install` en ambos entornos (Client y Server).</w:t>
+            </w:r>
+          </w:p>
+        </w:tc>
+      </w:tr>
+      <w:tr>
+        <w:tc>
+          <w:tcPr>
+            <w:tcW w:w="1728" w:type="dxa"/>
+          </w:tcPr>
+          <w:p>
+            <w:r>
+              <w:t>3</w:t>
+            </w:r>
+          </w:p>
+        </w:tc>
+        <w:tc>
+          <w:tcPr>
+            <w:tcW w:w="1728" w:type="dxa"/>
+          </w:tcPr>
+          <w:p>
+            <w:r>
+              <w:t>Configuración del archivo `.env`</w:t>
+            </w:r>
+          </w:p>
+        </w:tc>
+        <w:tc>
+          <w:tcPr>
+            <w:tcW w:w="1728" w:type="dxa"/>
+          </w:tcPr>
+          <w:p>
+            <w:r>
+              <w:t>DevOps</w:t>
+            </w:r>
+          </w:p>
+        </w:tc>
+        <w:tc>
+          <w:tcPr>
+            <w:tcW w:w="1728" w:type="dxa"/>
+          </w:tcPr>
+          <w:p>
+            <w:r>
+              <w:t>45 min</w:t>
+            </w:r>
+          </w:p>
+        </w:tc>
+        <w:tc>
+          <w:tcPr>
+            <w:tcW w:w="1728" w:type="dxa"/>
+          </w:tcPr>
+          <w:p>
+            <w:pPr>
+              <w:rPr>
+                <w:lang w:val="es-CO"/>
+              </w:rPr>
+            </w:pPr>
+            <w:r>
+              <w:rPr>
+                <w:lang w:val="es-CO"/>
+              </w:rPr>
+              <w:t>Crear el archivo `.env` con las variables de entorno necesarias.</w:t>
+            </w:r>
+          </w:p>
+        </w:tc>
+      </w:tr>
+      <w:tr>
+        <w:tc>
+          <w:tcPr>
+            <w:tcW w:w="1728" w:type="dxa"/>
+          </w:tcPr>
+          <w:p>
+            <w:r>
+              <w:t>4</w:t>
+            </w:r>
+          </w:p>
+        </w:tc>
+        <w:tc>
+          <w:tcPr>
+            <w:tcW w:w="1728" w:type="dxa"/>
+          </w:tcPr>
+          <w:p>
+            <w:pPr>
+              <w:rPr>
+                <w:lang w:val="es-CO"/>
+              </w:rPr>
+            </w:pPr>
+            <w:r>
+              <w:rPr>
+                <w:lang w:val="es-CO"/>
+              </w:rPr>
+              <w:t>Configuración del entorno local (opcional)</w:t>
+            </w:r>
+          </w:p>
+        </w:tc>
+        <w:tc>
+          <w:tcPr>
+            <w:tcW w:w="1728" w:type="dxa"/>
+          </w:tcPr>
+          <w:p>
+            <w:r>
+              <w:t>Todos</w:t>
+            </w:r>
+          </w:p>
+        </w:tc>
+        <w:tc>
+          <w:tcPr>
+            <w:tcW w:w="1728" w:type="dxa"/>
+          </w:tcPr>
+          <w:p>
+            <w:r>
+              <w:t>1 h</w:t>
+            </w:r>
+          </w:p>
+        </w:tc>
+        <w:tc>
+          <w:tcPr>
+            <w:tcW w:w="1728" w:type="dxa"/>
+          </w:tcPr>
+          <w:p>
+            <w:pPr>
+              <w:rPr>
+                <w:lang w:val="es-CO"/>
+              </w:rPr>
+            </w:pPr>
+            <w:r>
+              <w:rPr>
+                <w:lang w:val="es-CO"/>
+              </w:rPr>
+              <w:t>Levantar servicios con Docker, inicializar DB con `npm run setup:db` y ejecutar en local.</w:t>
+            </w:r>
+          </w:p>
+        </w:tc>
+      </w:tr>
+      <w:tr>
+        <w:tc>
+          <w:tcPr>
+            <w:tcW w:w="1728" w:type="dxa"/>
+          </w:tcPr>
+          <w:p>
+            <w:r>
+              <w:t>5</w:t>
+            </w:r>
+          </w:p>
+        </w:tc>
+        <w:tc>
+          <w:tcPr>
+            <w:tcW w:w="1728" w:type="dxa"/>
+          </w:tcPr>
+          <w:p>
+            <w:r>
+              <w:t>Configuración de Railway - Backend</w:t>
+            </w:r>
+          </w:p>
+        </w:tc>
+        <w:tc>
+          <w:tcPr>
+            <w:tcW w:w="1728" w:type="dxa"/>
+          </w:tcPr>
+          <w:p>
+            <w:r>
+              <w:t>DevOps</w:t>
+            </w:r>
+          </w:p>
+        </w:tc>
+        <w:tc>
+          <w:tcPr>
+            <w:tcW w:w="1728" w:type="dxa"/>
+          </w:tcPr>
+          <w:p>
+            <w:r>
+              <w:t>1.5 h</w:t>
+            </w:r>
+          </w:p>
+        </w:tc>
+        <w:tc>
+          <w:tcPr>
+            <w:tcW w:w="1728" w:type="dxa"/>
+          </w:tcPr>
+          <w:p>
+            <w:pPr>
+              <w:rPr>
+                <w:lang w:val="es-CO"/>
+              </w:rPr>
+            </w:pPr>
+            <w:r>
+              <w:rPr>
+                <w:lang w:val="es-CO"/>
+              </w:rPr>
+              <w:t>Crear proyecto Railway, conectar repositorio, configurar variables de entorno y despliegue automático.</w:t>
+            </w:r>
+          </w:p>
+        </w:tc>
+      </w:tr>
+      <w:tr>
+        <w:tc>
+          <w:tcPr>
+            <w:tcW w:w="1728" w:type="dxa"/>
+          </w:tcPr>
+          <w:p>
+            <w:r>
+              <w:t>6</w:t>
+            </w:r>
+          </w:p>
+        </w:tc>
+        <w:tc>
+          <w:tcPr>
+            <w:tcW w:w="1728" w:type="dxa"/>
+          </w:tcPr>
+          <w:p>
+            <w:pPr>
+              <w:rPr>
+                <w:lang w:val="es-CO"/>
+              </w:rPr>
+            </w:pPr>
+            <w:r>
+              <w:rPr>
+                <w:lang w:val="es-CO"/>
+              </w:rPr>
+              <w:t>Migraciones de base de datos en Railway</w:t>
+            </w:r>
+          </w:p>
+        </w:tc>
+        <w:tc>
+          <w:tcPr>
+            <w:tcW w:w="1728" w:type="dxa"/>
+          </w:tcPr>
+          <w:p>
+            <w:r>
+              <w:t>Backend Dev</w:t>
+            </w:r>
+          </w:p>
+        </w:tc>
+        <w:tc>
+          <w:tcPr>
+            <w:tcW w:w="1728" w:type="dxa"/>
+          </w:tcPr>
+          <w:p>
+            <w:r>
+              <w:t>30 min</w:t>
+            </w:r>
+          </w:p>
+        </w:tc>
+        <w:tc>
+          <w:tcPr>
+            <w:tcW w:w="1728" w:type="dxa"/>
+          </w:tcPr>
+          <w:p>
+            <w:pPr>
+              <w:rPr>
+                <w:lang w:val="es-CO"/>
+              </w:rPr>
+            </w:pPr>
+            <w:r>
+              <w:rPr>
+                <w:lang w:val="es-CO"/>
+              </w:rPr>
+              <w:t>Ejecutar `npx sequelize-cli db:migrate` en Railway.</w:t>
+            </w:r>
+          </w:p>
+        </w:tc>
+      </w:tr>
+      <w:tr>
+        <w:tc>
+          <w:tcPr>
+            <w:tcW w:w="1728" w:type="dxa"/>
+          </w:tcPr>
+          <w:p>
+            <w:r>
+              <w:t>7</w:t>
+            </w:r>
+          </w:p>
+        </w:tc>
+        <w:tc>
+          <w:tcPr>
+            <w:tcW w:w="1728" w:type="dxa"/>
+          </w:tcPr>
+          <w:p>
+            <w:pPr>
+              <w:rPr>
+                <w:lang w:val="es-CO"/>
+              </w:rPr>
+            </w:pPr>
+            <w:r>
+              <w:rPr>
+                <w:lang w:val="es-CO"/>
+              </w:rPr>
+              <w:t>Configuración de base de datos PostgreSQL</w:t>
+            </w:r>
+          </w:p>
+        </w:tc>
+        <w:tc>
+          <w:tcPr>
+            <w:tcW w:w="1728" w:type="dxa"/>
+          </w:tcPr>
+          <w:p>
+            <w:r>
+              <w:t>DevOps</w:t>
+            </w:r>
+          </w:p>
+        </w:tc>
+        <w:tc>
+          <w:tcPr>
+            <w:tcW w:w="1728" w:type="dxa"/>
+          </w:tcPr>
+          <w:p>
+            <w:r>
+              <w:t>1 h</w:t>
+            </w:r>
+          </w:p>
+        </w:tc>
+        <w:tc>
+          <w:tcPr>
+            <w:tcW w:w="1728" w:type="dxa"/>
+          </w:tcPr>
+          <w:p>
+            <w:pPr>
+              <w:rPr>
+                <w:lang w:val="es-CO"/>
+              </w:rPr>
+            </w:pPr>
+            <w:r>
+              <w:rPr>
+                <w:lang w:val="es-CO"/>
+              </w:rPr>
+              <w:t>Añadir plugin PostgreSQL en Railway y configurar `DATABASE_URL`.</w:t>
+            </w:r>
+          </w:p>
+        </w:tc>
+      </w:tr>
+      <w:tr>
+        <w:tc>
+          <w:tcPr>
+            <w:tcW w:w="1728" w:type="dxa"/>
+          </w:tcPr>
+          <w:p>
+            <w:r>
+              <w:t>8</w:t>
+            </w:r>
+          </w:p>
+        </w:tc>
+        <w:tc>
+          <w:tcPr>
+            <w:tcW w:w="1728" w:type="dxa"/>
+          </w:tcPr>
+          <w:p>
+            <w:pPr>
+              <w:rPr>
+                <w:lang w:val="es-CO"/>
+              </w:rPr>
+            </w:pPr>
+            <w:r>
+              <w:rPr>
+                <w:lang w:val="es-CO"/>
+              </w:rPr>
+              <w:t>Configuración y despliegue del Frontend</w:t>
+            </w:r>
+          </w:p>
+        </w:tc>
+        <w:tc>
+          <w:tcPr>
+            <w:tcW w:w="1728" w:type="dxa"/>
+          </w:tcPr>
+          <w:p>
+            <w:r>
+              <w:t>Frontend Dev</w:t>
+            </w:r>
+          </w:p>
+        </w:tc>
+        <w:tc>
+          <w:tcPr>
+            <w:tcW w:w="1728" w:type="dxa"/>
+          </w:tcPr>
+          <w:p>
+            <w:r>
+              <w:t>1 h</w:t>
+            </w:r>
+          </w:p>
+        </w:tc>
+        <w:tc>
+          <w:tcPr>
+            <w:tcW w:w="1728" w:type="dxa"/>
+          </w:tcPr>
+          <w:p>
+            <w:pPr>
+              <w:rPr>
+                <w:lang w:val="es-CO"/>
+              </w:rPr>
+            </w:pPr>
+            <w:r>
+              <w:rPr>
+                <w:lang w:val="es-CO"/>
+              </w:rPr>
+              <w:t>Crear proyecto Frontend en Railway, Vercel o Netlify, configurar `API_URL`.</w:t>
+            </w:r>
+          </w:p>
+        </w:tc>
+      </w:tr>
+      <w:tr>
+        <w:tc>
+          <w:tcPr>
+            <w:tcW w:w="1728" w:type="dxa"/>
+          </w:tcPr>
+          <w:p>
+            <w:r>
+              <w:t>9</w:t>
+            </w:r>
+          </w:p>
+        </w:tc>
+        <w:tc>
+          <w:tcPr>
+            <w:tcW w:w="1728" w:type="dxa"/>
+          </w:tcPr>
+          <w:p>
+            <w:r>
+              <w:t>Pruebas unitarias</w:t>
+            </w:r>
+          </w:p>
+        </w:tc>
+        <w:tc>
+          <w:tcPr>
+            <w:tcW w:w="1728" w:type="dxa"/>
+          </w:tcPr>
+          <w:p>
+            <w:r>
+              <w:t>QA / Backend Dev</w:t>
+            </w:r>
+          </w:p>
+        </w:tc>
+        <w:tc>
+          <w:tcPr>
+            <w:tcW w:w="1728" w:type="dxa"/>
+          </w:tcPr>
+          <w:p>
+            <w:r>
+              <w:t>1 h</w:t>
+            </w:r>
+          </w:p>
+        </w:tc>
+        <w:tc>
+          <w:tcPr>
+            <w:tcW w:w="1728" w:type="dxa"/>
+          </w:tcPr>
+          <w:p>
+            <w:pPr>
+              <w:rPr>
+                <w:lang w:val="es-CO"/>
+              </w:rPr>
+            </w:pPr>
+            <w:r>
+              <w:rPr>
+                <w:lang w:val="es-CO"/>
+              </w:rPr>
+              <w:t>Ejecutar `npm test` y verificar funcionamiento básico.</w:t>
+            </w:r>
+          </w:p>
+        </w:tc>
+      </w:tr>
+      <w:tr>
+        <w:tc>
+          <w:tcPr>
+            <w:tcW w:w="1728" w:type="dxa"/>
+          </w:tcPr>
+          <w:p>
+            <w:r>
+              <w:lastRenderedPageBreak/>
+              <w:t>10</w:t>
+            </w:r>
+          </w:p>
+        </w:tc>
+        <w:tc>
+          <w:tcPr>
+            <w:tcW w:w="1728" w:type="dxa"/>
+          </w:tcPr>
+          <w:p>
+            <w:r>
+              <w:t>Verificación final y documentación</w:t>
+            </w:r>
+          </w:p>
+        </w:tc>
+        <w:tc>
+          <w:tcPr>
+            <w:tcW w:w="1728" w:type="dxa"/>
+          </w:tcPr>
+          <w:p>
+            <w:r>
+              <w:t>Líder Técnico / DevOps</w:t>
+            </w:r>
+          </w:p>
+        </w:tc>
+        <w:tc>
+          <w:tcPr>
+            <w:tcW w:w="1728" w:type="dxa"/>
+          </w:tcPr>
+          <w:p>
+            <w:r>
+              <w:t>1 h</w:t>
+            </w:r>
+          </w:p>
+        </w:tc>
+        <w:tc>
+          <w:tcPr>
+            <w:tcW w:w="1728" w:type="dxa"/>
+          </w:tcPr>
+          <w:p>
+            <w:pPr>
+              <w:rPr>
+                <w:lang w:val="es-CO"/>
+              </w:rPr>
+            </w:pPr>
+            <w:r>
+              <w:rPr>
+                <w:lang w:val="es-CO"/>
+              </w:rPr>
+              <w:t>Validar todo el sistema en producción y documentar configuraciones finales.</w:t>
+            </w:r>
+          </w:p>
+        </w:tc>
+      </w:tr>
+    </w:tbl>
+    <w:p>
+      <w:pPr>
+        <w:pStyle w:val="Ttulo2"/>
+        <w:rPr>
+          <w:lang w:val="es-CO"/>
+        </w:rPr>
+      </w:pPr>
+    </w:p>
+    <w:p>
+      <w:pPr>
+        <w:rPr>
+          <w:lang w:val="es-CO"/>
+        </w:rPr>
+      </w:pPr>
     </w:p>
     <w:sectPr>
       <w:pgSz w:w="12240" w:h="15840"/>

</xml_diff>